<commit_message>
rationale and system description, state & decorator
</commit_message>
<xml_diff>
--- a/Practical4 PDF.docx
+++ b/Practical4 PDF.docx
@@ -1,6 +1,6 @@
 
 <file path=word/document.xml><?xml version="1.0" encoding="utf-8"?>
-<w:document xmlns:wpc="http://schemas.microsoft.com/office/word/2010/wordprocessingCanvas" xmlns:cx="http://schemas.microsoft.com/office/drawing/2014/chartex" xmlns:cx1="http://schemas.microsoft.com/office/drawing/2015/9/8/chartex" xmlns:cx2="http://schemas.microsoft.com/office/drawing/2015/10/21/chartex" xmlns:cx3="http://schemas.microsoft.com/office/drawing/2016/5/9/chartex" xmlns:cx4="http://schemas.microsoft.com/office/drawing/2016/5/10/chartex" xmlns:cx5="http://schemas.microsoft.com/office/drawing/2016/5/11/chartex" xmlns:cx6="http://schemas.microsoft.com/office/drawing/2016/5/12/chartex" xmlns:cx7="http://schemas.microsoft.com/office/drawing/2016/5/13/chartex" xmlns:cx8="http://schemas.microsoft.com/office/drawing/2016/5/14/chartex" xmlns:mc="http://schemas.openxmlformats.org/markup-compatibility/2006" xmlns:aink="http://schemas.microsoft.com/office/drawing/2016/ink" xmlns:am3d="http://schemas.microsoft.com/office/drawing/2017/model3d" xmlns:o="urn:schemas-microsoft-com:office:office" xmlns:oel="http://schemas.microsoft.com/office/2019/extlst" xmlns:r="http://schemas.openxmlformats.org/officeDocument/2006/relationships" xmlns:m="http://schemas.openxmlformats.org/officeDocument/2006/math" xmlns:v="urn:schemas-microsoft-com:vml" xmlns:wp14="http://schemas.microsoft.com/office/word/2010/wordprocessingDrawing" xmlns:wp="http://schemas.openxmlformats.org/drawingml/2006/wordprocessingDrawing" xmlns:w10="urn:schemas-microsoft-com:office:word" xmlns:w="http://schemas.openxmlformats.org/wordprocessingml/2006/main" xmlns:w14="http://schemas.microsoft.com/office/word/2010/wordml" xmlns:w15="http://schemas.microsoft.com/office/word/2012/wordml" xmlns:w16cex="http://schemas.microsoft.com/office/word/2018/wordml/cex" xmlns:w16cid="http://schemas.microsoft.com/office/word/2016/wordml/cid" xmlns:w16="http://schemas.microsoft.com/office/word/2018/wordml" xmlns:w16du="http://schemas.microsoft.com/office/word/2023/wordml/word16du" xmlns:w16sdtdh="http://schemas.microsoft.com/office/word/2020/wordml/sdtdatahash" xmlns:w16sdtfl="http://schemas.microsoft.com/office/word/2024/wordml/sdtformatlock" xmlns:w16se="http://schemas.microsoft.com/office/word/2015/wordml/symex" xmlns:wpg="http://schemas.microsoft.com/office/word/2010/wordprocessingGroup" xmlns:wpi="http://schemas.microsoft.com/office/word/2010/wordprocessingInk" xmlns:wne="http://schemas.microsoft.com/office/word/2006/wordml" xmlns:wps="http://schemas.microsoft.com/office/word/2010/wordprocessingShape" mc:Ignorable="w14 w15 w16se w16cid w16 w16cex w16sdtdh w16sdtfl w16du wp14">
+<w:document xmlns:wpc="http://schemas.microsoft.com/office/word/2010/wordprocessingCanvas" xmlns:cx="http://schemas.microsoft.com/office/drawing/2014/chartex" xmlns:cx1="http://schemas.microsoft.com/office/drawing/2015/9/8/chartex" xmlns:cx2="http://schemas.microsoft.com/office/drawing/2015/10/21/chartex" xmlns:cx3="http://schemas.microsoft.com/office/drawing/2016/5/9/chartex" xmlns:cx4="http://schemas.microsoft.com/office/drawing/2016/5/10/chartex" xmlns:cx5="http://schemas.microsoft.com/office/drawing/2016/5/11/chartex" xmlns:cx6="http://schemas.microsoft.com/office/drawing/2016/5/12/chartex" xmlns:cx7="http://schemas.microsoft.com/office/drawing/2016/5/13/chartex" xmlns:cx8="http://schemas.microsoft.com/office/drawing/2016/5/14/chartex" xmlns:mc="http://schemas.openxmlformats.org/markup-compatibility/2006" xmlns:aink="http://schemas.microsoft.com/office/drawing/2016/ink" xmlns:am3d="http://schemas.microsoft.com/office/drawing/2017/model3d" xmlns:o="urn:schemas-microsoft-com:office:office" xmlns:r="http://schemas.openxmlformats.org/officeDocument/2006/relationships" xmlns:m="http://schemas.openxmlformats.org/officeDocument/2006/math" xmlns:v="urn:schemas-microsoft-com:vml" xmlns:wp14="http://schemas.microsoft.com/office/word/2010/wordprocessingDrawing" xmlns:wp="http://schemas.openxmlformats.org/drawingml/2006/wordprocessingDrawing" xmlns:w10="urn:schemas-microsoft-com:office:word" xmlns:w="http://schemas.openxmlformats.org/wordprocessingml/2006/main" xmlns:w14="http://schemas.microsoft.com/office/word/2010/wordml" xmlns:w15="http://schemas.microsoft.com/office/word/2012/wordml" xmlns:w16cid="http://schemas.microsoft.com/office/word/2016/wordml/cid" xmlns:w16se="http://schemas.microsoft.com/office/word/2015/wordml/symex" xmlns:wpg="http://schemas.microsoft.com/office/word/2010/wordprocessingGroup" xmlns:wpi="http://schemas.microsoft.com/office/word/2010/wordprocessingInk" xmlns:wne="http://schemas.microsoft.com/office/word/2006/wordml" xmlns:wps="http://schemas.microsoft.com/office/word/2010/wordprocessingShape" mc:Ignorable="w14 w15 w16se w16cid wp14">
   <w:body>
     <w:p>
       <w:pPr>
@@ -31,6 +31,9 @@
       <w:r>
         <w:t xml:space="preserve">Takunda Mugwagwa </w:t>
       </w:r>
+      <w:r>
+        <w:t>u24667341</w:t>
+      </w:r>
     </w:p>
     <w:p/>
     <w:p>
@@ -55,7 +58,163 @@
         <w:t>Description</w:t>
       </w:r>
     </w:p>
+    <w:p>
+      <w:proofErr w:type="spellStart"/>
+      <w:r>
+        <w:t>TaskForge</w:t>
+      </w:r>
+      <w:proofErr w:type="spellEnd"/>
+      <w:r>
+        <w:t xml:space="preserve"> models a film production's workflow: </w:t>
+      </w:r>
+      <w:proofErr w:type="gramStart"/>
+      <w:r>
+        <w:t>an</w:t>
+      </w:r>
+      <w:proofErr w:type="gramEnd"/>
+      <w:r>
+        <w:t xml:space="preserve"> Act contains Sequences, which contain Scenes, which contain individual Shots. The system needs to treat single Shots and whole groups uniformly, traverse the hierarchy in different ways (full vs. urgent-only), track each Shot's lifecycle (Scripted → Shooting → Approved, with reshoots looping back), and attach optional, stackable extras like insurance or priority handling. </w:t>
+      </w:r>
+      <w:proofErr w:type="spellStart"/>
+      <w:r>
+        <w:t>TaskForge</w:t>
+      </w:r>
+      <w:proofErr w:type="spellEnd"/>
+      <w:r>
+        <w:t xml:space="preserve"> solves this with Composite (the Act/Sequence/Scene/Shot hierarchy), Iterator (full and urgent traversals), State (a Shot's lifecycle), and Decorator (stackable runtime responsibilities), combined into one coherent system rather than four separate demos.</w:t>
+      </w:r>
+    </w:p>
     <w:p/>
+    <w:p>
+      <w:pPr>
+        <w:rPr>
+          <w:b/>
+        </w:rPr>
+      </w:pPr>
+      <w:r>
+        <w:rPr>
+          <w:b/>
+        </w:rPr>
+        <w:t>Design Rationale</w:t>
+      </w:r>
+    </w:p>
+    <w:p>
+      <w:r>
+        <w:t xml:space="preserve">Composite: </w:t>
+      </w:r>
+      <w:proofErr w:type="spellStart"/>
+      <w:r>
+        <w:t>ProductionUnit</w:t>
+      </w:r>
+      <w:proofErr w:type="spellEnd"/>
+      <w:r>
+        <w:t xml:space="preserve"> is the shared interface for Shot (leaf) and </w:t>
+      </w:r>
+      <w:proofErr w:type="spellStart"/>
+      <w:r>
+        <w:t>ProductionGroup</w:t>
+      </w:r>
+      <w:proofErr w:type="spellEnd"/>
+      <w:r>
+        <w:t>/Act/Sequence/Scene (composites), so client code treats both uniformly. Groups own and delete their children.</w:t>
+      </w:r>
+    </w:p>
+    <w:p>
+      <w:r>
+        <w:t xml:space="preserve">Iterator: </w:t>
+      </w:r>
+      <w:proofErr w:type="spellStart"/>
+      <w:r>
+        <w:t>ProductionGroup</w:t>
+      </w:r>
+      <w:proofErr w:type="spellEnd"/>
+      <w:r>
+        <w:t xml:space="preserve"> never exposes its internal vector — only </w:t>
+      </w:r>
+      <w:proofErr w:type="spellStart"/>
+      <w:r>
+        <w:t>createFullIterator</w:t>
+      </w:r>
+      <w:proofErr w:type="spellEnd"/>
+      <w:r>
+        <w:t>()/</w:t>
+      </w:r>
+      <w:proofErr w:type="spellStart"/>
+      <w:proofErr w:type="gramStart"/>
+      <w:r>
+        <w:t>createUrgentIterator</w:t>
+      </w:r>
+      <w:proofErr w:type="spellEnd"/>
+      <w:r>
+        <w:t>(</w:t>
+      </w:r>
+      <w:proofErr w:type="gramEnd"/>
+      <w:r>
+        <w:t xml:space="preserve">). </w:t>
+      </w:r>
+      <w:proofErr w:type="spellStart"/>
+      <w:r>
+        <w:t>FullIterator</w:t>
+      </w:r>
+      <w:proofErr w:type="spellEnd"/>
+      <w:r>
+        <w:t xml:space="preserve"> does a complete pre-order traversal; </w:t>
+      </w:r>
+      <w:proofErr w:type="spellStart"/>
+      <w:r>
+        <w:t>UrgentIterator</w:t>
+      </w:r>
+      <w:proofErr w:type="spellEnd"/>
+      <w:r>
+        <w:t xml:space="preserve"> wraps its own </w:t>
+      </w:r>
+      <w:proofErr w:type="spellStart"/>
+      <w:r>
+        <w:t>FullIterator</w:t>
+      </w:r>
+      <w:proofErr w:type="spellEnd"/>
+      <w:r>
+        <w:t xml:space="preserve"> and filters for urgency, so two independent traversals can run over the same tree at once.</w:t>
+      </w:r>
+    </w:p>
+    <w:p>
+      <w:r>
+        <w:t xml:space="preserve">State: A Shot's behaviour (urgency, valid/invalid transitions) genuinely changes by lifecycle stage, so that logic lives in </w:t>
+      </w:r>
+      <w:proofErr w:type="spellStart"/>
+      <w:r>
+        <w:t>ShotState</w:t>
+      </w:r>
+      <w:proofErr w:type="spellEnd"/>
+      <w:r>
+        <w:t xml:space="preserve"> subclasses rather than conditionals in Shot. Shot owns its current state and deletes the old one on every transition.</w:t>
+      </w:r>
+    </w:p>
+    <w:p>
+      <w:r>
+        <w:t xml:space="preserve">Decorator: Responsibilities like insurance or priority are optional and combinable, so </w:t>
+      </w:r>
+      <w:proofErr w:type="spellStart"/>
+      <w:r>
+        <w:t>ProductionDecorator</w:t>
+      </w:r>
+      <w:proofErr w:type="spellEnd"/>
+      <w:r>
+        <w:t xml:space="preserve"> wraps any </w:t>
+      </w:r>
+      <w:proofErr w:type="spellStart"/>
+      <w:r>
+        <w:t>ProductionUnit</w:t>
+      </w:r>
+      <w:proofErr w:type="spellEnd"/>
+      <w:r>
+        <w:t xml:space="preserve"> and lets them stack at runtime, without exploding the class hierarchy. Each decorator owns and deletes what it wraps.</w:t>
+      </w:r>
+    </w:p>
+    <w:p>
+      <w:bookmarkStart w:id="0" w:name="_GoBack"/>
+      <w:bookmarkEnd w:id="0"/>
+    </w:p>
     <w:p>
       <w:pPr>
         <w:rPr>
@@ -135,6 +294,7 @@
           </w:tcPr>
           <w:p>
             <w:r>
+              <w:lastRenderedPageBreak/>
               <w:t>Component</w:t>
             </w:r>
           </w:p>
@@ -599,7 +759,18 @@
           <w:tcPr>
             <w:tcW w:w="2717" w:type="dxa"/>
           </w:tcPr>
-          <w:p/>
+          <w:p>
+            <w:proofErr w:type="spellStart"/>
+            <w:r>
+              <w:t>ProductionGroup</w:t>
+            </w:r>
+            <w:proofErr w:type="spellEnd"/>
+          </w:p>
+          <w:p>
+            <w:r>
+              <w:t>Shot</w:t>
+            </w:r>
+          </w:p>
         </w:tc>
       </w:tr>
       <w:tr>
@@ -623,7 +794,10 @@
           <w:p>
             <w:proofErr w:type="spellStart"/>
             <w:r>
-              <w:t>UnitDecorator</w:t>
+              <w:t>Production</w:t>
+            </w:r>
+            <w:r>
+              <w:t>Decorator</w:t>
             </w:r>
             <w:proofErr w:type="spellEnd"/>
           </w:p>
@@ -649,7 +823,21 @@
           <w:tcPr>
             <w:tcW w:w="2717" w:type="dxa"/>
           </w:tcPr>
-          <w:p/>
+          <w:p>
+            <w:proofErr w:type="spellStart"/>
+            <w:r>
+              <w:t>PriorityDecorator</w:t>
+            </w:r>
+            <w:proofErr w:type="spellEnd"/>
+            <w:r>
+              <w:t xml:space="preserve">, </w:t>
+            </w:r>
+            <w:proofErr w:type="spellStart"/>
+            <w:r>
+              <w:t>InsuranceDecorator</w:t>
+            </w:r>
+            <w:proofErr w:type="spellEnd"/>
+          </w:p>
         </w:tc>
       </w:tr>
     </w:tbl>
@@ -671,6 +859,7 @@
           <w:sz w:val="28"/>
           <w:szCs w:val="28"/>
         </w:rPr>
+        <w:lastRenderedPageBreak/>
         <w:br w:type="page"/>
       </w:r>
     </w:p>
@@ -883,7 +1072,7 @@
 </file>
 
 <file path=word/styles.xml><?xml version="1.0" encoding="utf-8"?>
-<w:styles xmlns:mc="http://schemas.openxmlformats.org/markup-compatibility/2006" xmlns:r="http://schemas.openxmlformats.org/officeDocument/2006/relationships" xmlns:w="http://schemas.openxmlformats.org/wordprocessingml/2006/main" xmlns:w14="http://schemas.microsoft.com/office/word/2010/wordml" xmlns:w15="http://schemas.microsoft.com/office/word/2012/wordml" xmlns:w16cex="http://schemas.microsoft.com/office/word/2018/wordml/cex" xmlns:w16cid="http://schemas.microsoft.com/office/word/2016/wordml/cid" xmlns:w16="http://schemas.microsoft.com/office/word/2018/wordml" xmlns:w16du="http://schemas.microsoft.com/office/word/2023/wordml/word16du" xmlns:w16sdtdh="http://schemas.microsoft.com/office/word/2020/wordml/sdtdatahash" xmlns:w16sdtfl="http://schemas.microsoft.com/office/word/2024/wordml/sdtformatlock" xmlns:w16se="http://schemas.microsoft.com/office/word/2015/wordml/symex" mc:Ignorable="w14 w15 w16se w16cid w16 w16cex w16sdtdh w16sdtfl w16du">
+<w:styles xmlns:mc="http://schemas.openxmlformats.org/markup-compatibility/2006" xmlns:r="http://schemas.openxmlformats.org/officeDocument/2006/relationships" xmlns:w="http://schemas.openxmlformats.org/wordprocessingml/2006/main" xmlns:w14="http://schemas.microsoft.com/office/word/2010/wordml" xmlns:w15="http://schemas.microsoft.com/office/word/2012/wordml" xmlns:w16cid="http://schemas.microsoft.com/office/word/2016/wordml/cid" xmlns:w16se="http://schemas.microsoft.com/office/word/2015/wordml/symex" mc:Ignorable="w14 w15 w16se w16cid">
   <w:docDefaults>
     <w:rPrDefault>
       <w:rPr>
@@ -901,7 +1090,7 @@
       </w:pPr>
     </w:pPrDefault>
   </w:docDefaults>
-  <w:latentStyles w:defLockedState="0" w:defUIPriority="99" w:defSemiHidden="0" w:defUnhideWhenUsed="0" w:defQFormat="0" w:count="376">
+  <w:latentStyles w:defLockedState="0" w:defUIPriority="99" w:defSemiHidden="0" w:defUnhideWhenUsed="0" w:defQFormat="0" w:count="375">
     <w:lsdException w:name="Normal" w:uiPriority="0" w:qFormat="1"/>
     <w:lsdException w:name="heading 1" w:uiPriority="9" w:qFormat="1"/>
     <w:lsdException w:name="heading 2" w:semiHidden="1" w:uiPriority="9" w:unhideWhenUsed="1" w:qFormat="1"/>
@@ -1277,7 +1466,6 @@
     <w:lsdException w:name="Smart Hyperlink" w:semiHidden="1" w:unhideWhenUsed="1"/>
     <w:lsdException w:name="Hashtag" w:semiHidden="1" w:unhideWhenUsed="1"/>
     <w:lsdException w:name="Unresolved Mention" w:semiHidden="1" w:unhideWhenUsed="1"/>
-    <w:lsdException w:name="Smart Link" w:semiHidden="1" w:unhideWhenUsed="1"/>
   </w:latentStyles>
   <w:style w:type="paragraph" w:default="1" w:styleId="Normal">
     <w:name w:val="Normal"/>

</xml_diff>

<commit_message>
Added the Object, State and Activity Diagrams
</commit_message>
<xml_diff>
--- a/Practical4 PDF.docx
+++ b/Practical4 PDF.docx
@@ -1,6 +1,6 @@
 
 <file path=word/document.xml><?xml version="1.0" encoding="utf-8"?>
-<w:document xmlns:wpc="http://schemas.microsoft.com/office/word/2010/wordprocessingCanvas" xmlns:cx="http://schemas.microsoft.com/office/drawing/2014/chartex" xmlns:cx1="http://schemas.microsoft.com/office/drawing/2015/9/8/chartex" xmlns:cx2="http://schemas.microsoft.com/office/drawing/2015/10/21/chartex" xmlns:cx3="http://schemas.microsoft.com/office/drawing/2016/5/9/chartex" xmlns:cx4="http://schemas.microsoft.com/office/drawing/2016/5/10/chartex" xmlns:cx5="http://schemas.microsoft.com/office/drawing/2016/5/11/chartex" xmlns:cx6="http://schemas.microsoft.com/office/drawing/2016/5/12/chartex" xmlns:cx7="http://schemas.microsoft.com/office/drawing/2016/5/13/chartex" xmlns:cx8="http://schemas.microsoft.com/office/drawing/2016/5/14/chartex" xmlns:mc="http://schemas.openxmlformats.org/markup-compatibility/2006" xmlns:aink="http://schemas.microsoft.com/office/drawing/2016/ink" xmlns:am3d="http://schemas.microsoft.com/office/drawing/2017/model3d" xmlns:o="urn:schemas-microsoft-com:office:office" xmlns:r="http://schemas.openxmlformats.org/officeDocument/2006/relationships" xmlns:m="http://schemas.openxmlformats.org/officeDocument/2006/math" xmlns:v="urn:schemas-microsoft-com:vml" xmlns:wp14="http://schemas.microsoft.com/office/word/2010/wordprocessingDrawing" xmlns:wp="http://schemas.openxmlformats.org/drawingml/2006/wordprocessingDrawing" xmlns:w10="urn:schemas-microsoft-com:office:word" xmlns:w="http://schemas.openxmlformats.org/wordprocessingml/2006/main" xmlns:w14="http://schemas.microsoft.com/office/word/2010/wordml" xmlns:w15="http://schemas.microsoft.com/office/word/2012/wordml" xmlns:w16cid="http://schemas.microsoft.com/office/word/2016/wordml/cid" xmlns:w16se="http://schemas.microsoft.com/office/word/2015/wordml/symex" xmlns:wpg="http://schemas.microsoft.com/office/word/2010/wordprocessingGroup" xmlns:wpi="http://schemas.microsoft.com/office/word/2010/wordprocessingInk" xmlns:wne="http://schemas.microsoft.com/office/word/2006/wordml" xmlns:wps="http://schemas.microsoft.com/office/word/2010/wordprocessingShape" mc:Ignorable="w14 w15 w16se w16cid wp14">
+<w:document xmlns:wpc="http://schemas.microsoft.com/office/word/2010/wordprocessingCanvas" xmlns:cx="http://schemas.microsoft.com/office/drawing/2014/chartex" xmlns:cx1="http://schemas.microsoft.com/office/drawing/2015/9/8/chartex" xmlns:cx2="http://schemas.microsoft.com/office/drawing/2015/10/21/chartex" xmlns:cx3="http://schemas.microsoft.com/office/drawing/2016/5/9/chartex" xmlns:cx4="http://schemas.microsoft.com/office/drawing/2016/5/10/chartex" xmlns:cx5="http://schemas.microsoft.com/office/drawing/2016/5/11/chartex" xmlns:cx6="http://schemas.microsoft.com/office/drawing/2016/5/12/chartex" xmlns:cx7="http://schemas.microsoft.com/office/drawing/2016/5/13/chartex" xmlns:cx8="http://schemas.microsoft.com/office/drawing/2016/5/14/chartex" xmlns:mc="http://schemas.openxmlformats.org/markup-compatibility/2006" xmlns:aink="http://schemas.microsoft.com/office/drawing/2016/ink" xmlns:am3d="http://schemas.microsoft.com/office/drawing/2017/model3d" xmlns:o="urn:schemas-microsoft-com:office:office" xmlns:oel="http://schemas.microsoft.com/office/2019/extlst" xmlns:r="http://schemas.openxmlformats.org/officeDocument/2006/relationships" xmlns:m="http://schemas.openxmlformats.org/officeDocument/2006/math" xmlns:v="urn:schemas-microsoft-com:vml" xmlns:wp14="http://schemas.microsoft.com/office/word/2010/wordprocessingDrawing" xmlns:wp="http://schemas.openxmlformats.org/drawingml/2006/wordprocessingDrawing" xmlns:w10="urn:schemas-microsoft-com:office:word" xmlns:w="http://schemas.openxmlformats.org/wordprocessingml/2006/main" xmlns:w14="http://schemas.microsoft.com/office/word/2010/wordml" xmlns:w15="http://schemas.microsoft.com/office/word/2012/wordml" xmlns:w16cex="http://schemas.microsoft.com/office/word/2018/wordml/cex" xmlns:w16cid="http://schemas.microsoft.com/office/word/2016/wordml/cid" xmlns:w16="http://schemas.microsoft.com/office/word/2018/wordml" xmlns:w16du="http://schemas.microsoft.com/office/word/2023/wordml/word16du" xmlns:w16sdtdh="http://schemas.microsoft.com/office/word/2020/wordml/sdtdatahash" xmlns:w16sdtfl="http://schemas.microsoft.com/office/word/2024/wordml/sdtformatlock" xmlns:w16se="http://schemas.microsoft.com/office/word/2015/wordml/symex" xmlns:wpg="http://schemas.microsoft.com/office/word/2010/wordprocessingGroup" xmlns:wpi="http://schemas.microsoft.com/office/word/2010/wordprocessingInk" xmlns:wne="http://schemas.microsoft.com/office/word/2006/wordml" xmlns:wps="http://schemas.microsoft.com/office/word/2010/wordprocessingShape" mc:Ignorable="w14 w15 w16se w16cid w16 w16cex w16sdtdh w16sdtfl w16du wp14">
   <w:body>
     <w:p>
       <w:pPr>
@@ -65,15 +65,7 @@
       </w:r>
       <w:proofErr w:type="spellEnd"/>
       <w:r>
-        <w:t xml:space="preserve"> models a film production's workflow: </w:t>
-      </w:r>
-      <w:proofErr w:type="gramStart"/>
-      <w:r>
-        <w:t>an</w:t>
-      </w:r>
-      <w:proofErr w:type="gramEnd"/>
-      <w:r>
-        <w:t xml:space="preserve"> Act contains Sequences, which contain Scenes, which contain individual Shots. The system needs to treat single Shots and whole groups uniformly, traverse the hierarchy in different ways (full vs. urgent-only), track each Shot's lifecycle (Scripted → Shooting → Approved, with reshoots looping back), and attach optional, stackable extras like insurance or priority handling. </w:t>
+        <w:t xml:space="preserve"> models a film production's workflow: an Act contains Sequences, which contain Scenes, which contain individual Shots. The system needs to treat single Shots and whole groups uniformly, traverse the hierarchy in different ways (full vs. urgent-only), track each Shot's lifecycle (Scripted → Shooting → Approved, with reshoots looping back), and attach optional, stackable extras like insurance or priority handling. </w:t>
       </w:r>
       <w:proofErr w:type="spellStart"/>
       <w:r>
@@ -211,10 +203,7 @@
         <w:t xml:space="preserve"> and lets them stack at runtime, without exploding the class hierarchy. Each decorator owns and deletes what it wraps.</w:t>
       </w:r>
     </w:p>
-    <w:p>
-      <w:bookmarkStart w:id="0" w:name="_GoBack"/>
-      <w:bookmarkEnd w:id="0"/>
-    </w:p>
+    <w:p/>
     <w:p>
       <w:pPr>
         <w:rPr>
@@ -265,6 +254,7 @@
           <w:p>
             <w:proofErr w:type="spellStart"/>
             <w:r>
+              <w:lastRenderedPageBreak/>
               <w:t>GoF</w:t>
             </w:r>
             <w:proofErr w:type="spellEnd"/>
@@ -294,7 +284,6 @@
           </w:tcPr>
           <w:p>
             <w:r>
-              <w:lastRenderedPageBreak/>
               <w:t>Component</w:t>
             </w:r>
           </w:p>
@@ -842,7 +831,6 @@
       </w:tr>
     </w:tbl>
     <w:p/>
-    <w:p/>
     <w:p>
       <w:pPr>
         <w:rPr>
@@ -859,7 +847,6 @@
           <w:sz w:val="28"/>
           <w:szCs w:val="28"/>
         </w:rPr>
-        <w:lastRenderedPageBreak/>
         <w:br w:type="page"/>
       </w:r>
     </w:p>
@@ -901,6 +888,54 @@
           <w:bCs/>
         </w:rPr>
       </w:pPr>
+      <w:r>
+        <w:rPr>
+          <w:b/>
+          <w:bCs/>
+          <w:noProof/>
+        </w:rPr>
+        <w:drawing>
+          <wp:inline distT="0" distB="0" distL="0" distR="0" wp14:anchorId="4F467894" wp14:editId="189C753A">
+            <wp:extent cx="5715495" cy="5479255"/>
+            <wp:effectExtent l="0" t="0" r="0" b="7620"/>
+            <wp:docPr id="385153435" name="Picture 1"/>
+            <wp:cNvGraphicFramePr>
+              <a:graphicFrameLocks xmlns:a="http://schemas.openxmlformats.org/drawingml/2006/main" noChangeAspect="1"/>
+            </wp:cNvGraphicFramePr>
+            <a:graphic xmlns:a="http://schemas.openxmlformats.org/drawingml/2006/main">
+              <a:graphicData uri="http://schemas.openxmlformats.org/drawingml/2006/picture">
+                <pic:pic xmlns:pic="http://schemas.openxmlformats.org/drawingml/2006/picture">
+                  <pic:nvPicPr>
+                    <pic:cNvPr id="385153435" name="Picture 385153435"/>
+                    <pic:cNvPicPr/>
+                  </pic:nvPicPr>
+                  <pic:blipFill>
+                    <a:blip r:embed="rId4">
+                      <a:extLst>
+                        <a:ext uri="{28A0092B-C50C-407E-A947-70E740481C1C}">
+                          <a14:useLocalDpi xmlns:a14="http://schemas.microsoft.com/office/drawing/2010/main" val="0"/>
+                        </a:ext>
+                      </a:extLst>
+                    </a:blip>
+                    <a:stretch>
+                      <a:fillRect/>
+                    </a:stretch>
+                  </pic:blipFill>
+                  <pic:spPr>
+                    <a:xfrm>
+                      <a:off x="0" y="0"/>
+                      <a:ext cx="5715495" cy="5479255"/>
+                    </a:xfrm>
+                    <a:prstGeom prst="rect">
+                      <a:avLst/>
+                    </a:prstGeom>
+                  </pic:spPr>
+                </pic:pic>
+              </a:graphicData>
+            </a:graphic>
+          </wp:inline>
+        </w:drawing>
+      </w:r>
     </w:p>
     <w:p>
       <w:pPr>
@@ -924,6 +959,54 @@
           <w:bCs/>
         </w:rPr>
       </w:pPr>
+      <w:r>
+        <w:rPr>
+          <w:b/>
+          <w:bCs/>
+          <w:noProof/>
+        </w:rPr>
+        <w:drawing>
+          <wp:inline distT="0" distB="0" distL="0" distR="0" wp14:anchorId="729327BE" wp14:editId="4FDEFFF1">
+            <wp:extent cx="5585944" cy="1356478"/>
+            <wp:effectExtent l="0" t="0" r="0" b="0"/>
+            <wp:docPr id="1808930819" name="Picture 2"/>
+            <wp:cNvGraphicFramePr>
+              <a:graphicFrameLocks xmlns:a="http://schemas.openxmlformats.org/drawingml/2006/main" noChangeAspect="1"/>
+            </wp:cNvGraphicFramePr>
+            <a:graphic xmlns:a="http://schemas.openxmlformats.org/drawingml/2006/main">
+              <a:graphicData uri="http://schemas.openxmlformats.org/drawingml/2006/picture">
+                <pic:pic xmlns:pic="http://schemas.openxmlformats.org/drawingml/2006/picture">
+                  <pic:nvPicPr>
+                    <pic:cNvPr id="1808930819" name="Picture 1808930819"/>
+                    <pic:cNvPicPr/>
+                  </pic:nvPicPr>
+                  <pic:blipFill>
+                    <a:blip r:embed="rId5">
+                      <a:extLst>
+                        <a:ext uri="{28A0092B-C50C-407E-A947-70E740481C1C}">
+                          <a14:useLocalDpi xmlns:a14="http://schemas.microsoft.com/office/drawing/2010/main" val="0"/>
+                        </a:ext>
+                      </a:extLst>
+                    </a:blip>
+                    <a:stretch>
+                      <a:fillRect/>
+                    </a:stretch>
+                  </pic:blipFill>
+                  <pic:spPr>
+                    <a:xfrm>
+                      <a:off x="0" y="0"/>
+                      <a:ext cx="5585944" cy="1356478"/>
+                    </a:xfrm>
+                    <a:prstGeom prst="rect">
+                      <a:avLst/>
+                    </a:prstGeom>
+                  </pic:spPr>
+                </pic:pic>
+              </a:graphicData>
+            </a:graphic>
+          </wp:inline>
+        </w:drawing>
+      </w:r>
     </w:p>
     <w:p>
       <w:pPr>
@@ -932,6 +1015,99 @@
           <w:bCs/>
         </w:rPr>
       </w:pPr>
+    </w:p>
+    <w:p>
+      <w:pPr>
+        <w:rPr>
+          <w:b/>
+          <w:bCs/>
+        </w:rPr>
+      </w:pPr>
+    </w:p>
+    <w:p>
+      <w:pPr>
+        <w:rPr>
+          <w:b/>
+          <w:bCs/>
+        </w:rPr>
+      </w:pPr>
+      <w:r>
+        <w:rPr>
+          <w:noProof/>
+        </w:rPr>
+        <w:lastRenderedPageBreak/>
+        <w:drawing>
+          <wp:anchor distT="0" distB="0" distL="114300" distR="114300" simplePos="0" relativeHeight="251658240" behindDoc="1" locked="0" layoutInCell="1" allowOverlap="1" wp14:anchorId="3EEA812A" wp14:editId="557DEBD4">
+            <wp:simplePos x="0" y="0"/>
+            <wp:positionH relativeFrom="column">
+              <wp:posOffset>373380</wp:posOffset>
+            </wp:positionH>
+            <wp:positionV relativeFrom="paragraph">
+              <wp:posOffset>318135</wp:posOffset>
+            </wp:positionV>
+            <wp:extent cx="2537460" cy="3063240"/>
+            <wp:effectExtent l="0" t="0" r="0" b="0"/>
+            <wp:wrapTight wrapText="bothSides">
+              <wp:wrapPolygon edited="0">
+                <wp:start x="324" y="0"/>
+                <wp:lineTo x="0" y="134"/>
+                <wp:lineTo x="0" y="20149"/>
+                <wp:lineTo x="162" y="20687"/>
+                <wp:lineTo x="20432" y="20687"/>
+                <wp:lineTo x="20919" y="19343"/>
+                <wp:lineTo x="21081" y="1746"/>
+                <wp:lineTo x="20595" y="269"/>
+                <wp:lineTo x="20270" y="0"/>
+                <wp:lineTo x="324" y="0"/>
+              </wp:wrapPolygon>
+            </wp:wrapTight>
+            <wp:docPr id="902122202" name="Picture 3"/>
+            <wp:cNvGraphicFramePr>
+              <a:graphicFrameLocks xmlns:a="http://schemas.openxmlformats.org/drawingml/2006/main" noChangeAspect="1"/>
+            </wp:cNvGraphicFramePr>
+            <a:graphic xmlns:a="http://schemas.openxmlformats.org/drawingml/2006/main">
+              <a:graphicData uri="http://schemas.openxmlformats.org/drawingml/2006/picture">
+                <pic:pic xmlns:pic="http://schemas.openxmlformats.org/drawingml/2006/picture">
+                  <pic:nvPicPr>
+                    <pic:cNvPr id="902122202" name="Picture 902122202"/>
+                    <pic:cNvPicPr/>
+                  </pic:nvPicPr>
+                  <pic:blipFill rotWithShape="1">
+                    <a:blip r:embed="rId6">
+                      <a:extLst>
+                        <a:ext uri="{28A0092B-C50C-407E-A947-70E740481C1C}">
+                          <a14:useLocalDpi xmlns:a14="http://schemas.microsoft.com/office/drawing/2010/main" val="0"/>
+                        </a:ext>
+                      </a:extLst>
+                    </a:blip>
+                    <a:srcRect r="55728" b="54223"/>
+                    <a:stretch>
+                      <a:fillRect/>
+                    </a:stretch>
+                  </pic:blipFill>
+                  <pic:spPr bwMode="auto">
+                    <a:xfrm>
+                      <a:off x="0" y="0"/>
+                      <a:ext cx="2537460" cy="3063240"/>
+                    </a:xfrm>
+                    <a:prstGeom prst="rect">
+                      <a:avLst/>
+                    </a:prstGeom>
+                    <a:ln>
+                      <a:noFill/>
+                    </a:ln>
+                    <a:extLst>
+                      <a:ext uri="{53640926-AAD7-44D8-BBD7-CCE9431645EC}">
+                        <a14:shadowObscured xmlns:a14="http://schemas.microsoft.com/office/drawing/2010/main"/>
+                      </a:ext>
+                    </a:extLst>
+                  </pic:spPr>
+                </pic:pic>
+              </a:graphicData>
+            </a:graphic>
+          </wp:anchor>
+        </w:drawing>
+      </w:r>
       <w:r>
         <w:rPr>
           <w:b/>
@@ -945,16 +1121,210 @@
         <w:t>1.</w:t>
       </w:r>
     </w:p>
-    <w:p>
+    <w:p/>
+    <w:p/>
+    <w:p/>
+    <w:p/>
+    <w:p/>
+    <w:p/>
+    <w:p/>
+    <w:p/>
+    <w:p/>
+    <w:p>
+      <w:r>
+        <w:rPr>
+          <w:noProof/>
+        </w:rPr>
+        <w:drawing>
+          <wp:anchor distT="0" distB="0" distL="114300" distR="114300" simplePos="0" relativeHeight="251659264" behindDoc="1" locked="0" layoutInCell="1" allowOverlap="1" wp14:anchorId="25449AEE" wp14:editId="4E1BDEF7">
+            <wp:simplePos x="0" y="0"/>
+            <wp:positionH relativeFrom="column">
+              <wp:posOffset>436245</wp:posOffset>
+            </wp:positionH>
+            <wp:positionV relativeFrom="paragraph">
+              <wp:posOffset>10160</wp:posOffset>
+            </wp:positionV>
+            <wp:extent cx="2736215" cy="3298190"/>
+            <wp:effectExtent l="0" t="0" r="6985" b="0"/>
+            <wp:wrapTight wrapText="bothSides">
+              <wp:wrapPolygon edited="0">
+                <wp:start x="752" y="0"/>
+                <wp:lineTo x="451" y="624"/>
+                <wp:lineTo x="301" y="20336"/>
+                <wp:lineTo x="902" y="21334"/>
+                <wp:lineTo x="21054" y="21334"/>
+                <wp:lineTo x="21505" y="20585"/>
+                <wp:lineTo x="21505" y="499"/>
+                <wp:lineTo x="21204" y="0"/>
+                <wp:lineTo x="752" y="0"/>
+              </wp:wrapPolygon>
+            </wp:wrapTight>
+            <wp:docPr id="1182933773" name="Picture 4"/>
+            <wp:cNvGraphicFramePr>
+              <a:graphicFrameLocks xmlns:a="http://schemas.openxmlformats.org/drawingml/2006/main" noChangeAspect="1"/>
+            </wp:cNvGraphicFramePr>
+            <a:graphic xmlns:a="http://schemas.openxmlformats.org/drawingml/2006/main">
+              <a:graphicData uri="http://schemas.openxmlformats.org/drawingml/2006/picture">
+                <pic:pic xmlns:pic="http://schemas.openxmlformats.org/drawingml/2006/picture">
+                  <pic:nvPicPr>
+                    <pic:cNvPr id="1182933773" name="Picture 1182933773"/>
+                    <pic:cNvPicPr/>
+                  </pic:nvPicPr>
+                  <pic:blipFill rotWithShape="1">
+                    <a:blip r:embed="rId6">
+                      <a:extLst>
+                        <a:ext uri="{28A0092B-C50C-407E-A947-70E740481C1C}">
+                          <a14:useLocalDpi xmlns:a14="http://schemas.microsoft.com/office/drawing/2010/main" val="0"/>
+                        </a:ext>
+                      </a:extLst>
+                    </a:blip>
+                    <a:srcRect l="57667" t="569" b="55729"/>
+                    <a:stretch>
+                      <a:fillRect/>
+                    </a:stretch>
+                  </pic:blipFill>
+                  <pic:spPr bwMode="auto">
+                    <a:xfrm>
+                      <a:off x="0" y="0"/>
+                      <a:ext cx="2736215" cy="3298190"/>
+                    </a:xfrm>
+                    <a:prstGeom prst="rect">
+                      <a:avLst/>
+                    </a:prstGeom>
+                    <a:ln>
+                      <a:noFill/>
+                    </a:ln>
+                    <a:extLst>
+                      <a:ext uri="{53640926-AAD7-44D8-BBD7-CCE9431645EC}">
+                        <a14:shadowObscured xmlns:a14="http://schemas.microsoft.com/office/drawing/2010/main"/>
+                      </a:ext>
+                    </a:extLst>
+                  </pic:spPr>
+                </pic:pic>
+              </a:graphicData>
+            </a:graphic>
+            <wp14:sizeRelH relativeFrom="margin">
+              <wp14:pctWidth>0</wp14:pctWidth>
+            </wp14:sizeRelH>
+            <wp14:sizeRelV relativeFrom="margin">
+              <wp14:pctHeight>0</wp14:pctHeight>
+            </wp14:sizeRelV>
+          </wp:anchor>
+        </w:drawing>
+      </w:r>
       <w:r>
         <w:t>2.</w:t>
       </w:r>
-    </w:p>
-    <w:p>
+      <w:r>
+        <w:t xml:space="preserve"> </w:t>
+      </w:r>
+    </w:p>
+    <w:p>
+      <w:r>
+        <w:tab/>
+      </w:r>
+    </w:p>
+    <w:p/>
+    <w:p/>
+    <w:p/>
+    <w:p/>
+    <w:p/>
+    <w:p/>
+    <w:p/>
+    <w:p/>
+    <w:p/>
+    <w:p/>
+    <w:p/>
+    <w:p/>
+    <w:p/>
+    <w:p/>
+    <w:p/>
+    <w:p>
+      <w:r>
+        <w:rPr>
+          <w:noProof/>
+        </w:rPr>
+        <w:lastRenderedPageBreak/>
+        <w:drawing>
+          <wp:anchor distT="0" distB="0" distL="114300" distR="114300" simplePos="0" relativeHeight="251660288" behindDoc="1" locked="0" layoutInCell="1" allowOverlap="1" wp14:anchorId="552513E7" wp14:editId="6E27B92C">
+            <wp:simplePos x="0" y="0"/>
+            <wp:positionH relativeFrom="column">
+              <wp:posOffset>477174</wp:posOffset>
+            </wp:positionH>
+            <wp:positionV relativeFrom="paragraph">
+              <wp:posOffset>-520</wp:posOffset>
+            </wp:positionV>
+            <wp:extent cx="2865120" cy="3491230"/>
+            <wp:effectExtent l="0" t="0" r="0" b="0"/>
+            <wp:wrapTight wrapText="bothSides">
+              <wp:wrapPolygon edited="0">
+                <wp:start x="144" y="471"/>
+                <wp:lineTo x="0" y="1061"/>
+                <wp:lineTo x="0" y="21097"/>
+                <wp:lineTo x="144" y="21451"/>
+                <wp:lineTo x="20681" y="21451"/>
+                <wp:lineTo x="20824" y="21333"/>
+                <wp:lineTo x="21112" y="19565"/>
+                <wp:lineTo x="20968" y="1179"/>
+                <wp:lineTo x="20681" y="471"/>
+                <wp:lineTo x="144" y="471"/>
+              </wp:wrapPolygon>
+            </wp:wrapTight>
+            <wp:docPr id="321130040" name="Picture 5"/>
+            <wp:cNvGraphicFramePr>
+              <a:graphicFrameLocks xmlns:a="http://schemas.openxmlformats.org/drawingml/2006/main" noChangeAspect="1"/>
+            </wp:cNvGraphicFramePr>
+            <a:graphic xmlns:a="http://schemas.openxmlformats.org/drawingml/2006/main">
+              <a:graphicData uri="http://schemas.openxmlformats.org/drawingml/2006/picture">
+                <pic:pic xmlns:pic="http://schemas.openxmlformats.org/drawingml/2006/picture">
+                  <pic:nvPicPr>
+                    <pic:cNvPr id="321130040" name="Picture 321130040"/>
+                    <pic:cNvPicPr/>
+                  </pic:nvPicPr>
+                  <pic:blipFill rotWithShape="1">
+                    <a:blip r:embed="rId6">
+                      <a:extLst>
+                        <a:ext uri="{28A0092B-C50C-407E-A947-70E740481C1C}">
+                          <a14:useLocalDpi xmlns:a14="http://schemas.microsoft.com/office/drawing/2010/main" val="0"/>
+                        </a:ext>
+                      </a:extLst>
+                    </a:blip>
+                    <a:srcRect t="47827" r="50011"/>
+                    <a:stretch>
+                      <a:fillRect/>
+                    </a:stretch>
+                  </pic:blipFill>
+                  <pic:spPr bwMode="auto">
+                    <a:xfrm>
+                      <a:off x="0" y="0"/>
+                      <a:ext cx="2865120" cy="3491230"/>
+                    </a:xfrm>
+                    <a:prstGeom prst="rect">
+                      <a:avLst/>
+                    </a:prstGeom>
+                    <a:ln>
+                      <a:noFill/>
+                    </a:ln>
+                    <a:extLst>
+                      <a:ext uri="{53640926-AAD7-44D8-BBD7-CCE9431645EC}">
+                        <a14:shadowObscured xmlns:a14="http://schemas.microsoft.com/office/drawing/2010/main"/>
+                      </a:ext>
+                    </a:extLst>
+                  </pic:spPr>
+                </pic:pic>
+              </a:graphicData>
+            </a:graphic>
+          </wp:anchor>
+        </w:drawing>
+      </w:r>
       <w:r>
         <w:t>3.</w:t>
       </w:r>
-    </w:p>
+      <w:r>
+        <w:t xml:space="preserve"> </w:t>
+      </w:r>
+    </w:p>
+    <w:p/>
     <w:p/>
     <w:p>
       <w:pPr>
@@ -963,15 +1333,71 @@
           <w:bCs/>
         </w:rPr>
       </w:pPr>
-      <w:r>
-        <w:rPr>
-          <w:b/>
-          <w:bCs/>
-        </w:rPr>
-        <w:t>Design Rationale</w:t>
-      </w:r>
-    </w:p>
-    <w:p/>
+    </w:p>
+    <w:p>
+      <w:pPr>
+        <w:rPr>
+          <w:b/>
+          <w:bCs/>
+        </w:rPr>
+      </w:pPr>
+    </w:p>
+    <w:p>
+      <w:pPr>
+        <w:rPr>
+          <w:b/>
+          <w:bCs/>
+        </w:rPr>
+      </w:pPr>
+    </w:p>
+    <w:p>
+      <w:pPr>
+        <w:rPr>
+          <w:b/>
+          <w:bCs/>
+        </w:rPr>
+      </w:pPr>
+    </w:p>
+    <w:p>
+      <w:pPr>
+        <w:rPr>
+          <w:b/>
+          <w:bCs/>
+        </w:rPr>
+      </w:pPr>
+    </w:p>
+    <w:p>
+      <w:pPr>
+        <w:rPr>
+          <w:b/>
+          <w:bCs/>
+        </w:rPr>
+      </w:pPr>
+    </w:p>
+    <w:p>
+      <w:pPr>
+        <w:rPr>
+          <w:b/>
+          <w:bCs/>
+        </w:rPr>
+      </w:pPr>
+    </w:p>
+    <w:p>
+      <w:pPr>
+        <w:rPr>
+          <w:b/>
+          <w:bCs/>
+        </w:rPr>
+      </w:pPr>
+    </w:p>
+    <w:p>
+      <w:pPr>
+        <w:rPr>
+          <w:b/>
+          <w:bCs/>
+        </w:rPr>
+      </w:pPr>
+    </w:p>
     <w:p>
       <w:pPr>
         <w:rPr>
@@ -1072,7 +1498,7 @@
 </file>
 
 <file path=word/styles.xml><?xml version="1.0" encoding="utf-8"?>
-<w:styles xmlns:mc="http://schemas.openxmlformats.org/markup-compatibility/2006" xmlns:r="http://schemas.openxmlformats.org/officeDocument/2006/relationships" xmlns:w="http://schemas.openxmlformats.org/wordprocessingml/2006/main" xmlns:w14="http://schemas.microsoft.com/office/word/2010/wordml" xmlns:w15="http://schemas.microsoft.com/office/word/2012/wordml" xmlns:w16cid="http://schemas.microsoft.com/office/word/2016/wordml/cid" xmlns:w16se="http://schemas.microsoft.com/office/word/2015/wordml/symex" mc:Ignorable="w14 w15 w16se w16cid">
+<w:styles xmlns:mc="http://schemas.openxmlformats.org/markup-compatibility/2006" xmlns:r="http://schemas.openxmlformats.org/officeDocument/2006/relationships" xmlns:w="http://schemas.openxmlformats.org/wordprocessingml/2006/main" xmlns:w14="http://schemas.microsoft.com/office/word/2010/wordml" xmlns:w15="http://schemas.microsoft.com/office/word/2012/wordml" xmlns:w16cex="http://schemas.microsoft.com/office/word/2018/wordml/cex" xmlns:w16cid="http://schemas.microsoft.com/office/word/2016/wordml/cid" xmlns:w16="http://schemas.microsoft.com/office/word/2018/wordml" xmlns:w16du="http://schemas.microsoft.com/office/word/2023/wordml/word16du" xmlns:w16sdtdh="http://schemas.microsoft.com/office/word/2020/wordml/sdtdatahash" xmlns:w16sdtfl="http://schemas.microsoft.com/office/word/2024/wordml/sdtformatlock" xmlns:w16se="http://schemas.microsoft.com/office/word/2015/wordml/symex" mc:Ignorable="w14 w15 w16se w16cid w16 w16cex w16sdtdh w16sdtfl w16du">
   <w:docDefaults>
     <w:rPrDefault>
       <w:rPr>
@@ -1090,7 +1516,7 @@
       </w:pPr>
     </w:pPrDefault>
   </w:docDefaults>
-  <w:latentStyles w:defLockedState="0" w:defUIPriority="99" w:defSemiHidden="0" w:defUnhideWhenUsed="0" w:defQFormat="0" w:count="375">
+  <w:latentStyles w:defLockedState="0" w:defUIPriority="99" w:defSemiHidden="0" w:defUnhideWhenUsed="0" w:defQFormat="0" w:count="376">
     <w:lsdException w:name="Normal" w:uiPriority="0" w:qFormat="1"/>
     <w:lsdException w:name="heading 1" w:uiPriority="9" w:qFormat="1"/>
     <w:lsdException w:name="heading 2" w:semiHidden="1" w:uiPriority="9" w:unhideWhenUsed="1" w:qFormat="1"/>
@@ -1466,6 +1892,7 @@
     <w:lsdException w:name="Smart Hyperlink" w:semiHidden="1" w:unhideWhenUsed="1"/>
     <w:lsdException w:name="Hashtag" w:semiHidden="1" w:unhideWhenUsed="1"/>
     <w:lsdException w:name="Unresolved Mention" w:semiHidden="1" w:unhideWhenUsed="1"/>
+    <w:lsdException w:name="Smart Link" w:semiHidden="1" w:unhideWhenUsed="1"/>
   </w:latentStyles>
   <w:style w:type="paragraph" w:default="1" w:styleId="Normal">
     <w:name w:val="Normal"/>

</xml_diff>